<commit_message>
feat(saff-study): publish specification and test suite v1.3
</commit_message>
<xml_diff>
--- a/output/docx/CRUDDocumentos.docx
+++ b/output/docx/CRUDDocumentos.docx
@@ -261,17 +261,17 @@
               <w:rPr>
                 <w:sz w:val="18"/>
               </w:rPr>
-              <w:t>system: SYSTEM: exibe página com campos de cadastro de novo documento</w:t>
-            </w:r>
-          </w:p>
-        </w:tc>
-        <w:tc>
-          <w:p>
-            <w:r>
-              <w:rPr>
-                <w:sz w:val="18"/>
-              </w:rPr>
-              <w:t>exibe página com campos de cadastro de novo documento</w:t>
+              <w:t>system: SYSTEM: exibe pagina com campos de cadastro de novo documento</w:t>
+            </w:r>
+          </w:p>
+        </w:tc>
+        <w:tc>
+          <w:p>
+            <w:r>
+              <w:rPr>
+                <w:sz w:val="18"/>
+              </w:rPr>
+              <w:t>exibe pagina com campos de cadastro de novo documento</w:t>
             </w:r>
           </w:p>
         </w:tc>
@@ -453,17 +453,17 @@
               <w:rPr>
                 <w:sz w:val="18"/>
               </w:rPr>
-              <w:t>system: SYSTEM: se existir extração da familia cadastrada, esta deve exibir no campo Document um link para o novo documento</w:t>
-            </w:r>
-          </w:p>
-        </w:tc>
-        <w:tc>
-          <w:p>
-            <w:r>
-              <w:rPr>
-                <w:sz w:val="18"/>
-              </w:rPr>
-              <w:t>se existir extração da familia cadastrada, esta deve exibir no campo Document um link para o novo documento</w:t>
+              <w:t>system: SYSTEM: se existir extracao da familia cadastrada, esta deve exibir no campo Document um link para o novo documento</w:t>
+            </w:r>
+          </w:p>
+        </w:tc>
+        <w:tc>
+          <w:p>
+            <w:r>
+              <w:rPr>
+                <w:sz w:val="18"/>
+              </w:rPr>
+              <w:t>se existir extracao da familia cadastrada, esta deve exibir no campo Document um link para o novo documento</w:t>
             </w:r>
           </w:p>
         </w:tc>

</xml_diff>